<commit_message>
Grafana AAA dashbord as part of initial deploment and Prometheus connectivity
</commit_message>
<xml_diff>
--- a/docs/aaa-platform-product-description.docx
+++ b/docs/aaa-platform-product-description.docx
@@ -13557,6 +13557,62 @@
       <w:pPr>
         <w:spacing w:after="80"/>
       </w:pPr>
+    </w:p>
+    <w:p>
+      <w:pPr>
+        <w:pStyle w:val="Heading2"/>
+      </w:pPr>
+      <w:r>
+        <w:t>5.7 Radius Static IP Assignment Flow</w:t>
+      </w:r>
+    </w:p>
+    <w:p>
+      <w:r>
+        <w:t xml:space="preserve">The diagram below shows the end-to-end RADIUS message flow for static IP assignment. Stage 1 is handled entirely by aaa-lookup-service against the read replica (hot path, p99 &lt; 15 ms). Stage 2 (first-connection) is triggered only on a 404 response and performs atomic IP allocation via subscriber-profile-api against the primary database.</w:t>
+      </w:r>
+    </w:p>
+    <w:p>
+      <w:pPr>
+        <w:spacing w:before="120" w:after="120"/>
+        <w:jc w:val="center"/>
+      </w:pPr>
+      <w:r>
+        <w:drawing>
+          <wp:inline xmlns:wp="http://schemas.openxmlformats.org/drawingml/2006/wordprocessingDrawing" distT="0" distB="0" distL="0" distR="0">
+            <wp:extent cx="5943600" cy="3099000"/>
+            <wp:effectExtent l="0" t="0" r="0" b="0"/>
+            <wp:docPr id="101" name="sequence_diagram" descr="Radius Static IP Assignment Flow"/>
+            <wp:cNvGraphicFramePr>
+              <a:graphicFrameLocks xmlns:a="http://schemas.openxmlformats.org/drawingml/2006/main" noChangeAspect="1"/>
+            </wp:cNvGraphicFramePr>
+            <a:graphic xmlns:a="http://schemas.openxmlformats.org/drawingml/2006/main">
+              <a:graphicData uri="http://schemas.openxmlformats.org/drawingml/2006/picture">
+                <pic:pic xmlns:pic="http://schemas.openxmlformats.org/drawingml/2006/picture">
+                  <pic:nvPicPr>
+                    <pic:cNvPr id="101" name="sequence_diagram.png"/>
+                    <pic:cNvPicPr/>
+                  </pic:nvPicPr>
+                  <pic:blipFill>
+                    <a:blip r:embed="rId10"/>
+                    <a:stretch>
+                      <a:fillRect/>
+                    </a:stretch>
+                  </pic:blipFill>
+                  <pic:spPr>
+                    <a:xfrm>
+                      <a:off x="0" y="0"/>
+                      <a:ext cx="5943600" cy="3099000"/>
+                    </a:xfrm>
+                    <a:prstGeom prst="rect">
+                      <a:avLst/>
+                    </a:prstGeom>
+                  </pic:spPr>
+                </pic:pic>
+              </a:graphicData>
+            </a:graphic>
+          </wp:inline>
+        </w:drawing>
+      </w:r>
     </w:p>
     <w:p>
       <w:r>

</xml_diff>

<commit_message>
Move stage logic from radius to lookup pod, CIDR finder fixes
</commit_message>
<xml_diff>
--- a/docs/aaa-platform-product-description.docx
+++ b/docs/aaa-platform-product-description.docx
@@ -614,7 +614,7 @@
                 <w:sz w:val="18"/>
                 <w:szCs w:val="18"/>
               </w:rPr>
-              <w:t xml:space="preserve">Authentication frontend; routes Access-Requests to aaa-lookup-service; calls subscriber-profile-api on first connection</w:t>
+              <w:t xml:space="preserve">Authentication frontend; makes a single GET /lookup call to aaa-lookup-service per Access-Request; aaa-lookup-service handles first-connection internally</w:t>
             </w:r>
           </w:p>
         </w:tc>
@@ -736,7 +736,7 @@
                 <w:sz w:val="18"/>
                 <w:szCs w:val="18"/>
               </w:rPr>
-              <w:t xml:space="preserve">RADIUS hot-path IMSI lookup (read-only); called by aaa-radius-server on every Access-Request</w:t>
+              <w:t xml:space="preserve">RADIUS hot-path IMSI lookup; called by aaa-radius-server on every Access-Request; calls subscriber-profile-api on first-connection when IMSI is not found in DB</w:t>
             </w:r>
           </w:p>
         </w:tc>
@@ -858,7 +858,7 @@
                 <w:sz w:val="18"/>
                 <w:szCs w:val="18"/>
               </w:rPr>
-              <w:t xml:space="preserve">Subscriber provisioning &amp; first-connection allocation; called by aaa-radius-server when aaa-lookup-service returns 404</w:t>
+              <w:t xml:space="preserve">Subscriber provisioning &amp; first-connection allocation; called by aaa-lookup-service when IMSI is not found in the database</w:t>
             </w:r>
           </w:p>
         </w:tc>
@@ -1282,7 +1282,7 @@
         <w:spacing w:after="120"/>
       </w:pPr>
       <w:r>
-        <w:t xml:space="preserve">aaa-radius-server is the RADIUS authentication gateway for the platform. It receives RADIUS Access-Request messages from network equipment (e.g., PGW, ePDG) and orchestrates the two-stage authentication flow:</w:t>
+        <w:t xml:space="preserve">aaa-radius-server is the RADIUS authentication gateway for the platform. It receives RADIUS Access-Request messages from network equipment (e.g., PGW, ePDG) and makes a single REST call to aaa-lookup-service per request:</w:t>
       </w:r>
     </w:p>
     <w:p>
@@ -1295,7 +1295,7 @@
         <w:spacing w:after="60"/>
       </w:pPr>
       <w:r>
-        <w:t xml:space="preserve">Stage 1 — Hot path: On every Access-Request, aaa-radius-server sends a GET /lookup request to aaa-lookup-service with the subscriber IMSI and APN. If the lookup succeeds (HTTP 200), aaa-radius-server extracts the Framed-IP-Address from the response and issues a RADIUS Access-Accept immediately. End-to-end latency target: &lt;15ms p99.</w:t>
+        <w:t xml:space="preserve">Hot path: On every Access-Request, aaa-radius-server sends a GET /lookup request to aaa-lookup-service with the subscriber IMSI, APN, and IMEI. If the lookup succeeds (HTTP 200), aaa-radius-server extracts the Framed-IP-Address from the response and issues a RADIUS Access-Accept immediately. End-to-end latency target: &lt;15ms p99.</w:t>
       </w:r>
     </w:p>
     <w:p>
@@ -1308,7 +1308,7 @@
         <w:spacing w:after="60"/>
       </w:pPr>
       <w:r>
-        <w:t xml:space="preserve">Stage 2 — First connection: If aaa-lookup-service returns HTTP 404 (IMSI not yet provisioned), aaa-radius-server falls through to a POST /v1/first-connection call on subscriber-profile-api. The API dynamically allocates an IP address, creates the subscriber profile, and returns a device_id and static_ip. aaa-radius-server then issues an Access-Accept with the assigned IP.</w:t>
+        <w:t xml:space="preserve">First connection (internal to aaa-lookup-service): If aaa-lookup-service returns HTTP 404 (IMSI not yet provisioned), If the IMSI is not in the database, aaa-lookup-service calls POST /v1/first-connection on subscriber-profile-api. The API dynamically allocates an IP, creates the subscriber profile, and returns the static_ip. aaa-lookup-service returns the IP to aaa-radius-server, which issues an Access-Accept.</w:t>
       </w:r>
     </w:p>
     <w:p>
@@ -1321,7 +1321,7 @@
         <w:spacing w:after="60"/>
       </w:pPr>
       <w:r>
-        <w:t xml:space="preserve">Reject path: If subscriber-profile-api returns 404 (no matching range config) or the subscriber is suspended (HTTP 403), aaa-radius-server issues a RADIUS Access-Reject.</w:t>
+        <w:t xml:space="preserve">Reject path: If no range config matches the IMSI (404), the pool is exhausted (503), or the subscriber is suspended (403), aaa-lookup-service returns the appropriate status and aaa-radius-server issues a RADIUS Access-Reject.</w:t>
       </w:r>
     </w:p>
     <w:p>
@@ -2728,7 +2728,7 @@
                 <w:sz w:val="18"/>
                 <w:szCs w:val="18"/>
               </w:rPr>
-              <w:t xml:space="preserve">device_profiles</w:t>
+              <w:t xml:space="preserve">sim_profiles</w:t>
             </w:r>
           </w:p>
         </w:tc>
@@ -2758,7 +2758,7 @@
                 <w:sz w:val="18"/>
                 <w:szCs w:val="18"/>
               </w:rPr>
-              <w:t xml:space="preserve">device_id (UUID)</w:t>
+              <w:t xml:space="preserve">sim_id (UUID)</w:t>
             </w:r>
           </w:p>
         </w:tc>
@@ -2820,7 +2820,7 @@
                 <w:sz w:val="18"/>
                 <w:szCs w:val="18"/>
               </w:rPr>
-              <w:t xml:space="preserve">imsi2device</w:t>
+              <w:t xml:space="preserve">imsi2sim</w:t>
             </w:r>
           </w:p>
         </w:tc>
@@ -2880,7 +2880,7 @@
                 <w:sz w:val="18"/>
                 <w:szCs w:val="18"/>
               </w:rPr>
-              <w:t xml:space="preserve">One row per IMSI. Multiple IMSIs may share the same device_id (Multi-IMSI SIM).</w:t>
+              <w:t xml:space="preserve">One row per IMSI. Multiple IMSIs may share the same sim_id (Multi-IMSI SIM).</w:t>
             </w:r>
           </w:p>
         </w:tc>
@@ -3004,7 +3004,7 @@
                 <w:sz w:val="18"/>
                 <w:szCs w:val="18"/>
               </w:rPr>
-              <w:t xml:space="preserve">device_apn_ips</w:t>
+              <w:t xml:space="preserve">sim_apn_ips</w:t>
             </w:r>
           </w:p>
         </w:tc>
@@ -3612,7 +3612,7 @@
         <w:spacing w:after="120"/>
       </w:pPr>
       <w:r>
-        <w:t xml:space="preserve">The ip_resolution field on device_profiles controls how the lookup service selects the IP address for an Access-Request:</w:t>
+        <w:t xml:space="preserve">The ip_resolution field on sim_profiles controls how the lookup service selects the IP address for an Access-Request:</w:t>
       </w:r>
     </w:p>
     <w:p>
@@ -3982,7 +3982,7 @@
                 <w:sz w:val="18"/>
                 <w:szCs w:val="18"/>
               </w:rPr>
-              <w:t xml:space="preserve">device_apn_ips</w:t>
+              <w:t xml:space="preserve">sim_apn_ips</w:t>
             </w:r>
           </w:p>
         </w:tc>
@@ -4074,7 +4074,7 @@
                 <w:sz w:val="18"/>
                 <w:szCs w:val="18"/>
               </w:rPr>
-              <w:t xml:space="preserve">device_apn_ips</w:t>
+              <w:t xml:space="preserve">sim_apn_ips</w:t>
             </w:r>
           </w:p>
         </w:tc>
@@ -4503,7 +4503,7 @@
                 <w:sz w:val="18"/>
                 <w:szCs w:val="18"/>
               </w:rPr>
-              <w:t xml:space="preserve">/v1/profiles/{device_id}</w:t>
+              <w:t xml:space="preserve">/v1/profiles/{sim_id}</w:t>
             </w:r>
           </w:p>
         </w:tc>
@@ -4869,7 +4869,7 @@
                 <w:sz w:val="18"/>
                 <w:szCs w:val="18"/>
               </w:rPr>
-              <w:t xml:space="preserve">/v1/profiles/{device_id}</w:t>
+              <w:t xml:space="preserve">/v1/profiles/{sim_id}</w:t>
             </w:r>
           </w:p>
         </w:tc>
@@ -4991,7 +4991,7 @@
                 <w:sz w:val="18"/>
                 <w:szCs w:val="18"/>
               </w:rPr>
-              <w:t xml:space="preserve">/v1/profiles/{device_id}</w:t>
+              <w:t xml:space="preserve">/v1/profiles/{sim_id}</w:t>
             </w:r>
           </w:p>
         </w:tc>
@@ -5113,7 +5113,7 @@
                 <w:sz w:val="18"/>
                 <w:szCs w:val="18"/>
               </w:rPr>
-              <w:t xml:space="preserve">/v1/profiles/{device_id}</w:t>
+              <w:t xml:space="preserve">/v1/profiles/{sim_id}</w:t>
             </w:r>
           </w:p>
         </w:tc>
@@ -7855,7 +7855,7 @@
         <w:spacing w:after="80"/>
       </w:pPr>
       <w:r>
-        <w:t xml:space="preserve">aaa-radius-server sends: GET /lookup?imsi={imsi}&amp;apn={apn} with Bearer JWT</w:t>
+        <w:t xml:space="preserve">aaa-radius-server sends: GET /lookup?imsi={imsi}&amp;apn={apn}&amp;imei={imei} with Bearer JWT</w:t>
       </w:r>
     </w:p>
     <w:p>
@@ -7881,7 +7881,7 @@
         <w:spacing w:after="80"/>
       </w:pPr>
       <w:r>
-        <w:t xml:space="preserve">Resolver applies ip_resolution logic: for mode 'imsi', returns imsi_apn_ips.static_ip; for 'iccid', returns device_apn_ips.static_ip</w:t>
+        <w:t xml:space="preserve">Resolver applies ip_resolution logic: for mode 'imsi', returns imsi_apn_ips.static_ip; for 'iccid', returns sim_apn_ips.static_ip</w:t>
       </w:r>
     </w:p>
     <w:p>
@@ -8289,7 +8289,7 @@
                 <w:sz w:val="18"/>
                 <w:szCs w:val="18"/>
               </w:rPr>
-              <w:t xml:space="preserve">Triggers Stage 2 (first-connection)</w:t>
+              <w:t xml:space="preserve">Access-Reject (no range config); first-connection returned 404</w:t>
             </w:r>
           </w:p>
         </w:tc>
@@ -8451,7 +8451,7 @@
           <w:sz w:val="18"/>
           <w:szCs w:val="18"/>
         </w:rPr>
-        <w:t xml:space="preserve">SELECT sp.device_id, sp.status AS sim_status, sp.ip_resolution,</w:t>
+        <w:t xml:space="preserve">SELECT sp.sim_id, sp.status AS sim_status, sp.ip_resolution,</w:t>
       </w:r>
     </w:p>
     <w:p>
@@ -8531,7 +8531,7 @@
           <w:sz w:val="18"/>
           <w:szCs w:val="18"/>
         </w:rPr>
-        <w:t xml:space="preserve">FROM   imsi2device si</w:t>
+        <w:t xml:space="preserve">FROM   imsi2sim si</w:t>
       </w:r>
     </w:p>
     <w:p>
@@ -8551,7 +8551,7 @@
           <w:sz w:val="18"/>
           <w:szCs w:val="18"/>
         </w:rPr>
-        <w:t xml:space="preserve">JOIN   device_profiles sp ON sp.device_id = si.device_id</w:t>
+        <w:t xml:space="preserve">JOIN   sim_profiles sp ON sp.sim_id = si.sim_id</w:t>
       </w:r>
     </w:p>
     <w:p>
@@ -8591,7 +8591,7 @@
           <w:sz w:val="18"/>
           <w:szCs w:val="18"/>
         </w:rPr>
-        <w:t xml:space="preserve">LEFT JOIN device_apn_ips ci ON ci.device_id = sp.device_id</w:t>
+        <w:t xml:space="preserve">LEFT JOIN sim_apn_ips ci ON ci.sim_id = sp.sim_id</w:t>
       </w:r>
     </w:p>
     <w:p>
@@ -8627,7 +8627,7 @@
         <w:rPr>
           <w:color w:val="404040"/>
         </w:rPr>
-        <w:t xml:space="preserve">Performance: Index seek on imsi2device.imsi (PK) -&gt; nested loop on device_profiles (PK) -&gt; left-joins on low-cardinality IP tables. Typical: p50 1-3ms, p99 3-8ms on a warm replica.</w:t>
+        <w:t xml:space="preserve">Performance: Index seek on imsi2sim.imsi (PK) -&gt; nested loop on sim_profiles (PK) -&gt; left-joins on low-cardinality IP tables. Typical: p50 1-3ms, p99 3-8ms on a warm replica.</w:t>
       </w:r>
     </w:p>
     <w:p>
@@ -8644,7 +8644,7 @@
           <w:b w:val="false"/>
           <w:bCs w:val="false"/>
         </w:rPr>
-        <w:t xml:space="preserve">5.2 Two-Stage First-Connection Allocation</w:t>
+        <w:t xml:space="preserve">5.2 First-Connection Allocation (Orchestrated by aaa-lookup-service)</w:t>
       </w:r>
     </w:p>
     <w:p>
@@ -8652,7 +8652,7 @@
         <w:spacing w:after="120"/>
       </w:pPr>
       <w:r>
-        <w:t xml:space="preserve">When aaa-lookup-service returns 404, aaa-radius-server falls through to Stage 2: calling subscriber-profile-api to dynamically allocate and register the unknown IMSI. This flow is rare once the network is warm.</w:t>
+        <w:t xml:space="preserve">When the DB hot-path query returns 0 rows, aaa-lookup-service calls subscriber-profile-api directly to dynamically allocate and register the unknown IMSI, then returns the IP to aaa-radius-server. This flow is rare once the network is warm.</w:t>
       </w:r>
     </w:p>
     <w:p>
@@ -8669,7 +8669,7 @@
           <w:b w:val="false"/>
           <w:bCs w:val="false"/>
         </w:rPr>
-        <w:t xml:space="preserve">Stage 1 (aaa-lookup-service) -&gt; 404</w:t>
+        <w:t xml:space="preserve">DB Lookup → Not Found</w:t>
       </w:r>
     </w:p>
     <w:p>
@@ -8695,7 +8695,7 @@
         <w:spacing w:after="80"/>
       </w:pPr>
       <w:r>
-        <w:t xml:space="preserve">Query returns 0 rows: IMSI not in imsi2device</w:t>
+        <w:t xml:space="preserve">Query returns 0 rows: IMSI not in imsi2sim</w:t>
       </w:r>
     </w:p>
     <w:p>
@@ -8738,7 +8738,7 @@
           <w:b w:val="false"/>
           <w:bCs w:val="false"/>
         </w:rPr>
-        <w:t xml:space="preserve">Stage 2 (subscriber-profile-api) - Single-IMSI Path</w:t>
+        <w:t xml:space="preserve">subscriber-profile-api — Single-IMSI Allocation Path</w:t>
       </w:r>
     </w:p>
     <w:p>
@@ -8751,7 +8751,7 @@
         <w:spacing w:after="80"/>
       </w:pPr>
       <w:r>
-        <w:t xml:space="preserve">aaa-radius-server sends: POST /v1/first-connection {"imsi": "278773000002042", "apn": "internet.operator.com", "imei": "..."}</w:t>
+        <w:t xml:space="preserve">aaa-lookup-service sends: POST /v1/first-connection {"imsi": "278773000002042", "apn": "internet.operator.com", "imei": "..."}</w:t>
       </w:r>
     </w:p>
     <w:p>
@@ -8764,7 +8764,7 @@
         <w:spacing w:after="80"/>
       </w:pPr>
       <w:r>
-        <w:t xml:space="preserve">Idempotency check: SELECT from imsi2device WHERE imsi=$1. If found, return existing IP immediately.</w:t>
+        <w:t xml:space="preserve">Idempotency check: SELECT from imsi2sim WHERE imsi=$1. If found, return existing IP immediately.</w:t>
       </w:r>
     </w:p>
     <w:p>
@@ -8842,7 +8842,7 @@
         <w:spacing w:after="80"/>
       </w:pPr>
       <w:r>
-        <w:t xml:space="preserve">INSERT device_profiles, imsi2device, imsi_apn_ips (or iccid_ips based on ip_resolution mode)</w:t>
+        <w:t xml:space="preserve">INSERT sim_profiles, imsi2sim, imsi_apn_ips (or iccid_ips based on ip_resolution mode)</w:t>
       </w:r>
     </w:p>
     <w:p>
@@ -8868,7 +8868,7 @@
         <w:spacing w:after="80"/>
       </w:pPr>
       <w:r>
-        <w:t xml:space="preserve">Return 200 {"device_id": "...", "static_ip": "100.65.120.5"}</w:t>
+        <w:t xml:space="preserve">Return 200 {"sim_id": "...", "static_ip": "100.65.120.5"}</w:t>
       </w:r>
     </w:p>
     <w:p>
@@ -8881,7 +8881,7 @@
         <w:spacing w:after="80"/>
       </w:pPr>
       <w:r>
-        <w:t xml:space="preserve">aaa-radius-server issues Access-Accept with Framed-IP-Address</w:t>
+        <w:t xml:space="preserve">subscriber-profile-api returns 201; aaa-lookup-service returns 200 {static_ip} to aaa-radius-server; aaa-radius-server issues Access-Accept</w:t>
       </w:r>
     </w:p>
     <w:p>
@@ -8940,7 +8940,7 @@
               <w:spacing w:after="0"/>
             </w:pPr>
             <w:r>
-              <w:t xml:space="preserve">If aaa-radius-server retries the POST /first-connection call (e.g., on timeout), the second call detects the already-provisioned IMSI in step 2 and returns the same device_id and static_ip without creating duplicates.</w:t>
+              <w:t xml:space="preserve">If aaa-lookup-service retries the POST /first-connection call (e.g., on timeout), the second call detects the already-provisioned IMSI in step 2 and returns the same sim_id and static_ip without creating duplicates.</w:t>
             </w:r>
           </w:p>
         </w:tc>
@@ -9168,7 +9168,7 @@
         <w:spacing w:after="80"/>
       </w:pPr>
       <w:r>
-        <w:t xml:space="preserve">Stage 1: GET /lookup for slot-1 IMSI returns 404</w:t>
+        <w:t xml:space="preserve">GET /lookup for slot-1 IMSI: 0 rows in DB</w:t>
       </w:r>
     </w:p>
     <w:p>
@@ -9181,7 +9181,7 @@
         <w:spacing w:after="80"/>
       </w:pPr>
       <w:r>
-        <w:t xml:space="preserve">Stage 2: POST /first-connection with slot-1 IMSI</w:t>
+        <w:t xml:space="preserve">aaa-lookup-service calls POST /first-connection with slot-1 IMSI</w:t>
       </w:r>
     </w:p>
     <w:p>
@@ -9220,7 +9220,7 @@
         <w:spacing w:after="80"/>
       </w:pPr>
       <w:r>
-        <w:t xml:space="preserve">Lock: SELECT FROM device_profiles WHERE iccid=$derived_iccid FOR UPDATE</w:t>
+        <w:t xml:space="preserve">Lock: SELECT FROM sim_profiles WHERE iccid=$derived_iccid FOR UPDATE</w:t>
       </w:r>
     </w:p>
     <w:p>
@@ -9259,7 +9259,7 @@
         <w:spacing w:after="40"/>
       </w:pPr>
       <w:r>
-        <w:t xml:space="preserve">INSERT device_profiles with derived ICCID</w:t>
+        <w:t xml:space="preserve">INSERT sim_profiles with derived ICCID</w:t>
       </w:r>
     </w:p>
     <w:p>
@@ -9272,7 +9272,7 @@
         <w:spacing w:after="40"/>
       </w:pPr>
       <w:r>
-        <w:t xml:space="preserve">For each sibling slot: compute sibling IMSI (same offset), allocate IP from sibling's pool, INSERT imsi2device + IP assignment</w:t>
+        <w:t xml:space="preserve">For each sibling slot: compute sibling IMSI (same offset), allocate IP from sibling's pool, INSERT imsi2sim + IP assignment</w:t>
       </w:r>
     </w:p>
     <w:p>
@@ -9298,7 +9298,7 @@
         <w:spacing w:after="80"/>
       </w:pPr>
       <w:r>
-        <w:t xml:space="preserve">Return 201 with connecting IMSI's device_id and static_ip</w:t>
+        <w:t xml:space="preserve">Return 201 with connecting IMSI's sim_id and static_ip</w:t>
       </w:r>
     </w:p>
     <w:p>
@@ -9311,7 +9311,7 @@
         <w:spacing w:after="80"/>
       </w:pPr>
       <w:r>
-        <w:t xml:space="preserve">Next time slot 2 IMSI connects: Stage 1 returns 200 immediately (already provisioned)</w:t>
+        <w:t xml:space="preserve">Next time slot 2 IMSI connects: GET /lookup returns 200 immediately from DB hot-path (already provisioned)</w:t>
       </w:r>
     </w:p>
     <w:p>
@@ -11185,7 +11185,7 @@
         <w:spacing w:after="120"/>
       </w:pPr>
       <w:r>
-        <w:t xml:space="preserve">All scenarios are idempotent. On any repeat call, the platform detects the IMSI in imsi2device and returns the existing IP with a single indexed read and no allocation. For multi-IMSI SIMs, sibling slots pre-provisioned in the original transaction are served from the fast hot-path on every subsequent connection — zero write pressure at steady state.</w:t>
+        <w:t xml:space="preserve">All scenarios are idempotent. On any repeat call, the platform detects the IMSI in imsi2sim and returns the existing IP with a single indexed read and no allocation. For multi-IMSI SIMs, sibling slots pre-provisioned in the original transaction are served from the fast hot-path on every subsequent connection — zero write pressure at steady state.</w:t>
       </w:r>
     </w:p>
     <w:p>
@@ -11549,7 +11549,7 @@
           <w:sz w:val="18"/>
           <w:szCs w:val="18"/>
         </w:rPr>
-        <w:t xml:space="preserve">{"device_id": "550e8400-e29b-41d4-a716-446655440000", "created_at": "2026-03-13T10:00:00Z"}</w:t>
+        <w:t xml:space="preserve">{"sim_id": "550e8400-e29b-41d4-a716-446655440000", "created_at": "2026-03-13T10:00:00Z"}</w:t>
       </w:r>
     </w:p>
     <w:p>
@@ -11562,7 +11562,7 @@
         <w:spacing w:after="120"/>
       </w:pPr>
       <w:r>
-        <w:t xml:space="preserve">The API validates all fields (15 validation rules), runs the INSERT in a single atomic transaction, and returns the auto-generated device_id UUID.</w:t>
+        <w:t xml:space="preserve">The API validates all fields (15 validation rules), runs the INSERT in a single atomic transaction, and returns the auto-generated sim_id UUID.</w:t>
       </w:r>
     </w:p>
     <w:p>
@@ -13559,62 +13559,6 @@
       </w:pPr>
     </w:p>
     <w:p>
-      <w:pPr>
-        <w:pStyle w:val="Heading2"/>
-      </w:pPr>
-      <w:r>
-        <w:t>5.7 Radius Static IP Assignment Flow</w:t>
-      </w:r>
-    </w:p>
-    <w:p>
-      <w:r>
-        <w:t xml:space="preserve">The diagram below shows the end-to-end RADIUS message flow for static IP assignment. Stage 1 is handled entirely by aaa-lookup-service against the read replica (hot path, p99 &lt; 15 ms). Stage 2 (first-connection) is triggered only on a 404 response and performs atomic IP allocation via subscriber-profile-api against the primary database.</w:t>
-      </w:r>
-    </w:p>
-    <w:p>
-      <w:pPr>
-        <w:spacing w:before="120" w:after="120"/>
-        <w:jc w:val="center"/>
-      </w:pPr>
-      <w:r>
-        <w:drawing>
-          <wp:inline xmlns:wp="http://schemas.openxmlformats.org/drawingml/2006/wordprocessingDrawing" distT="0" distB="0" distL="0" distR="0">
-            <wp:extent cx="5943600" cy="3099000"/>
-            <wp:effectExtent l="0" t="0" r="0" b="0"/>
-            <wp:docPr id="101" name="sequence_diagram" descr="Radius Static IP Assignment Flow"/>
-            <wp:cNvGraphicFramePr>
-              <a:graphicFrameLocks xmlns:a="http://schemas.openxmlformats.org/drawingml/2006/main" noChangeAspect="1"/>
-            </wp:cNvGraphicFramePr>
-            <a:graphic xmlns:a="http://schemas.openxmlformats.org/drawingml/2006/main">
-              <a:graphicData uri="http://schemas.openxmlformats.org/drawingml/2006/picture">
-                <pic:pic xmlns:pic="http://schemas.openxmlformats.org/drawingml/2006/picture">
-                  <pic:nvPicPr>
-                    <pic:cNvPr id="101" name="sequence_diagram.png"/>
-                    <pic:cNvPicPr/>
-                  </pic:nvPicPr>
-                  <pic:blipFill>
-                    <a:blip r:embed="rId10"/>
-                    <a:stretch>
-                      <a:fillRect/>
-                    </a:stretch>
-                  </pic:blipFill>
-                  <pic:spPr>
-                    <a:xfrm>
-                      <a:off x="0" y="0"/>
-                      <a:ext cx="5943600" cy="3099000"/>
-                    </a:xfrm>
-                    <a:prstGeom prst="rect">
-                      <a:avLst/>
-                    </a:prstGeom>
-                  </pic:spPr>
-                </pic:pic>
-              </a:graphicData>
-            </a:graphic>
-          </wp:inline>
-        </w:drawing>
-      </w:r>
-    </w:p>
-    <w:p>
       <w:r>
         <w:br w:type="page"/>
       </w:r>
@@ -16786,6 +16730,98 @@
           </w:p>
         </w:tc>
       </w:tr>
+      <w:tr>
+        <w:tc>
+          <w:tcPr>
+            <w:tcW w:type="dxa" w:w="2800"/>
+            <w:tcBorders>
+              <w:top w:val="single" w:color="CCCCCC" w:sz="1"/>
+              <w:left w:val="single" w:color="CCCCCC" w:sz="1"/>
+              <w:bottom w:val="single" w:color="CCCCCC" w:sz="1"/>
+              <w:right w:val="single" w:color="CCCCCC" w:sz="1"/>
+            </w:tcBorders>
+            <w:shd w:fill="FFFFFF" w:val="clear"/>
+            <w:tcMar>
+              <w:top w:type="dxa" w:w="80"/>
+              <w:left w:type="dxa" w:w="120"/>
+              <w:bottom w:type="dxa" w:w="80"/>
+              <w:right w:type="dxa" w:w="120"/>
+            </w:tcMar>
+          </w:tcPr>
+          <w:p>
+            <w:pPr>
+              <w:spacing w:after="0"/>
+            </w:pPr>
+            <w:r>
+              <w:rPr>
+                <w:sz w:val="18"/>
+                <w:szCs w:val="18"/>
+              </w:rPr>
+              <w:t xml:space="preserve">PROVISIONING_URL</w:t>
+            </w:r>
+          </w:p>
+        </w:tc>
+        <w:tc>
+          <w:tcPr>
+            <w:tcW w:type="dxa" w:w="1600"/>
+            <w:tcBorders>
+              <w:top w:val="single" w:color="CCCCCC" w:sz="1"/>
+              <w:left w:val="single" w:color="CCCCCC" w:sz="1"/>
+              <w:bottom w:val="single" w:color="CCCCCC" w:sz="1"/>
+              <w:right w:val="single" w:color="CCCCCC" w:sz="1"/>
+            </w:tcBorders>
+            <w:shd w:fill="FFFFFF" w:val="clear"/>
+            <w:tcMar>
+              <w:top w:type="dxa" w:w="80"/>
+              <w:left w:type="dxa" w:w="120"/>
+              <w:bottom w:type="dxa" w:w="80"/>
+              <w:right w:type="dxa" w:w="120"/>
+            </w:tcMar>
+          </w:tcPr>
+          <w:p>
+            <w:pPr>
+              <w:spacing w:after="0"/>
+            </w:pPr>
+            <w:r>
+              <w:rPr>
+                <w:sz w:val="18"/>
+                <w:szCs w:val="18"/>
+              </w:rPr>
+              <w:t xml:space="preserve">http://subscriber-profile-api:8080</w:t>
+            </w:r>
+          </w:p>
+        </w:tc>
+        <w:tc>
+          <w:tcPr>
+            <w:tcW w:type="dxa" w:w="4960"/>
+            <w:tcBorders>
+              <w:top w:val="single" w:color="CCCCCC" w:sz="1"/>
+              <w:left w:val="single" w:color="CCCCCC" w:sz="1"/>
+              <w:bottom w:val="single" w:color="CCCCCC" w:sz="1"/>
+              <w:right w:val="single" w:color="CCCCCC" w:sz="1"/>
+            </w:tcBorders>
+            <w:shd w:fill="FFFFFF" w:val="clear"/>
+            <w:tcMar>
+              <w:top w:type="dxa" w:w="80"/>
+              <w:left w:type="dxa" w:w="120"/>
+              <w:bottom w:type="dxa" w:w="80"/>
+              <w:right w:type="dxa" w:w="120"/>
+            </w:tcMar>
+          </w:tcPr>
+          <w:p>
+            <w:pPr>
+              <w:spacing w:after="0"/>
+            </w:pPr>
+            <w:r>
+              <w:rPr>
+                <w:sz w:val="18"/>
+                <w:szCs w:val="18"/>
+              </w:rPr>
+              <w:t xml:space="preserve">Base URL for subscriber-profile-api (first-connection allocation calls)</w:t>
+            </w:r>
+          </w:p>
+        </w:tc>
+      </w:tr>
     </w:tbl>
     <w:p>
       <w:pPr>
@@ -17196,7 +17232,7 @@
                 <w:sz w:val="18"/>
                 <w:szCs w:val="18"/>
               </w:rPr>
-              <w:t xml:space="preserve">Base URL for aaa-lookup-service (Stage 1 hot-path calls)</w:t>
+              <w:t xml:space="preserve">Base URL for aaa-lookup-service (the only upstream service called by aaa-radius-server)</w:t>
             </w:r>
           </w:p>
         </w:tc>
@@ -17228,7 +17264,7 @@
                 <w:sz w:val="18"/>
                 <w:szCs w:val="18"/>
               </w:rPr>
-              <w:t xml:space="preserve">PROVISIONING_URL</w:t>
+              <w:t xml:space="preserve">WORKER_THREADS</w:t>
             </w:r>
           </w:p>
         </w:tc>
@@ -17258,7 +17294,7 @@
                 <w:sz w:val="18"/>
                 <w:szCs w:val="18"/>
               </w:rPr>
-              <w:t xml:space="preserve">http://subscriber-profile-api:8080</w:t>
+              <w:t xml:space="preserve">8</w:t>
             </w:r>
           </w:p>
         </w:tc>
@@ -17272,98 +17308,6 @@
               <w:right w:val="single" w:color="CCCCCC" w:sz="1"/>
             </w:tcBorders>
             <w:shd w:fill="F2F2F2" w:val="clear"/>
-            <w:tcMar>
-              <w:top w:type="dxa" w:w="80"/>
-              <w:left w:type="dxa" w:w="120"/>
-              <w:bottom w:type="dxa" w:w="80"/>
-              <w:right w:type="dxa" w:w="120"/>
-            </w:tcMar>
-          </w:tcPr>
-          <w:p>
-            <w:pPr>
-              <w:spacing w:after="0"/>
-            </w:pPr>
-            <w:r>
-              <w:rPr>
-                <w:sz w:val="18"/>
-                <w:szCs w:val="18"/>
-              </w:rPr>
-              <w:t xml:space="preserve">Base URL for subscriber-profile-api (Stage 2 first-connection calls)</w:t>
-            </w:r>
-          </w:p>
-        </w:tc>
-      </w:tr>
-      <w:tr>
-        <w:tc>
-          <w:tcPr>
-            <w:tcW w:type="dxa" w:w="2800"/>
-            <w:tcBorders>
-              <w:top w:val="single" w:color="CCCCCC" w:sz="1"/>
-              <w:left w:val="single" w:color="CCCCCC" w:sz="1"/>
-              <w:bottom w:val="single" w:color="CCCCCC" w:sz="1"/>
-              <w:right w:val="single" w:color="CCCCCC" w:sz="1"/>
-            </w:tcBorders>
-            <w:shd w:fill="FFFFFF" w:val="clear"/>
-            <w:tcMar>
-              <w:top w:type="dxa" w:w="80"/>
-              <w:left w:type="dxa" w:w="120"/>
-              <w:bottom w:type="dxa" w:w="80"/>
-              <w:right w:type="dxa" w:w="120"/>
-            </w:tcMar>
-          </w:tcPr>
-          <w:p>
-            <w:pPr>
-              <w:spacing w:after="0"/>
-            </w:pPr>
-            <w:r>
-              <w:rPr>
-                <w:sz w:val="18"/>
-                <w:szCs w:val="18"/>
-              </w:rPr>
-              <w:t xml:space="preserve">WORKER_THREADS</w:t>
-            </w:r>
-          </w:p>
-        </w:tc>
-        <w:tc>
-          <w:tcPr>
-            <w:tcW w:type="dxa" w:w="1600"/>
-            <w:tcBorders>
-              <w:top w:val="single" w:color="CCCCCC" w:sz="1"/>
-              <w:left w:val="single" w:color="CCCCCC" w:sz="1"/>
-              <w:bottom w:val="single" w:color="CCCCCC" w:sz="1"/>
-              <w:right w:val="single" w:color="CCCCCC" w:sz="1"/>
-            </w:tcBorders>
-            <w:shd w:fill="FFFFFF" w:val="clear"/>
-            <w:tcMar>
-              <w:top w:type="dxa" w:w="80"/>
-              <w:left w:type="dxa" w:w="120"/>
-              <w:bottom w:type="dxa" w:w="80"/>
-              <w:right w:type="dxa" w:w="120"/>
-            </w:tcMar>
-          </w:tcPr>
-          <w:p>
-            <w:pPr>
-              <w:spacing w:after="0"/>
-            </w:pPr>
-            <w:r>
-              <w:rPr>
-                <w:sz w:val="18"/>
-                <w:szCs w:val="18"/>
-              </w:rPr>
-              <w:t xml:space="preserve">8</w:t>
-            </w:r>
-          </w:p>
-        </w:tc>
-        <w:tc>
-          <w:tcPr>
-            <w:tcW w:type="dxa" w:w="4960"/>
-            <w:tcBorders>
-              <w:top w:val="single" w:color="CCCCCC" w:sz="1"/>
-              <w:left w:val="single" w:color="CCCCCC" w:sz="1"/>
-              <w:bottom w:val="single" w:color="CCCCCC" w:sz="1"/>
-              <w:right w:val="single" w:color="CCCCCC" w:sz="1"/>
-            </w:tcBorders>
-            <w:shd w:fill="FFFFFF" w:val="clear"/>
             <w:tcMar>
               <w:top w:type="dxa" w:w="80"/>
               <w:left w:type="dxa" w:w="120"/>

</xml_diff>